<commit_message>
docs: add final project report, evaluation, requirements, and screenshots documentation
</commit_message>
<xml_diff>
--- a/docs/weekly-reports/Week 8_Final Engineering Report.docx
+++ b/docs/weekly-reports/Week 8_Final Engineering Report.docx
@@ -114,7 +114,7 @@
         <w:t>What the team delivered.</w:t>
       </w:r>
       <w:r>
-        <w:t xml:space="preserve"> Policy retrieval with citations that found the correct source for all five answerable test questions; exact repayment, debt-service-ratio, savings-limit and security-coverage calculations; a bounded agent loop with a six-iteration cap and defined stop conditions; an authorization layer that blocks high-impact actions; and a persistent case memory with three safety invariants. Ten synthetic member profiles produced correct rule outcomes, and all 32 automated tests pass (re-run during final review).</w:t>
+        <w:t xml:space="preserve"> Policy retrieval with citations that found the correct source for all five answerable test questions; exact repayment, debt-service-ratio, savings-limit and security-coverage calculations; a bounded agent loop with a six-iteration cap and defined stop conditions; an authorization layer that blocks high-impact actions; and a persistent case memory with three safety invariants. Ten synthetic member profiles produced correct rule outcomes, and all 44 automated tests pass (re-run during final review, covering RAG, tool authorization, persistent memory, and safety guardrails).</w:t>
       </w:r>
     </w:p>
     <w:p>
@@ -3916,7 +3916,7 @@
         <w:spacing w:after="100" w:line="276" w:lineRule="auto"/>
       </w:pPr>
       <w:r>
-        <w:t xml:space="preserve">The deterministic parts of the system are covered by repeatable tests: 32 automated tests (7 retrieval, 18 tools and authorization, 7 memory) all pass without an API key. The generated brief and retrieval were checked on ten profiles and fifteen questions, enough to find useful improvements but not to estimate failure rates with confidence. A 50-scenario evaluation set defines expected behaviour for normal, edge, incorrect-information, adversarial, tool-failure </w:t>
+        <w:t xml:space="preserve">The deterministic parts of the system are covered by repeatable tests: 44 automated tests (7 retrieval, 18 tools and authorization, 7 memory, and 12 application guardrails) all pass without an API key. The generated brief and retrieval were checked on ten profiles and fifteen questions, enough to find useful improvements but not to estimate failure rates with confidence. A 50-scenario evaluation set defines expected behaviour for normal, edge, incorrect-information, adversarial, tool-failure </w:t>
       </w:r>
       <w:r>
         <w:lastRenderedPageBreak/>
@@ -4070,16 +4070,8 @@
             </w:tcMar>
           </w:tcPr>
           <w:p>
-            <w:pPr>
-              <w:keepNext/>
-              <w:spacing w:line="276" w:lineRule="auto"/>
-            </w:pPr>
-            <w:r>
-              <w:rPr>
-                <w:sz w:val="20"/>
-                <w:szCs w:val="20"/>
-              </w:rPr>
-              <w:t>7 retrieval, 18 tools and authorization, 7 memory</w:t>
+            <w:r>
+              <w:t>7 retrieval, 18 tools/auth, 7 memory, 12 guardrails</w:t>
             </w:r>
           </w:p>
         </w:tc>
@@ -4094,16 +4086,8 @@
             </w:tcMar>
           </w:tcPr>
           <w:p>
-            <w:pPr>
-              <w:keepNext/>
-              <w:spacing w:line="276" w:lineRule="auto"/>
-            </w:pPr>
-            <w:r>
-              <w:rPr>
-                <w:sz w:val="20"/>
-                <w:szCs w:val="20"/>
-              </w:rPr>
-              <w:t>32 of 32 pass</w:t>
+            <w:r>
+              <w:t>44 of 44 pass</w:t>
             </w:r>
           </w:p>
         </w:tc>
@@ -4992,7 +4976,7 @@
         <w:t>Process.</w:t>
       </w:r>
       <w:r>
-        <w:t xml:space="preserve"> The team worked in weekly cycles with one deliverable set per week. Tasks and owners were tracked on a ClickUp board, and all work was kept in a single GitHub repository following the folder structure set by the lecturer, with progress reports for Weeks 1 to 6 in docs/weekly-reports.</w:t>
+        <w:t xml:space="preserve"> The team worked in weekly cycles with one deliverable set per week. Tasks and owners were tracked on a ClickUp board, and all work was kept in a single GitHub repository following the folder structure set by the lecturer, with progress reports for Weeks 1 to 8 in docs/weekly-reports.</w:t>
       </w:r>
     </w:p>
     <w:p>

</xml_diff>